<commit_message>
Digitize 10 Attributes from official Excel templates and add Meeting Agenda Question Configurator
- Extracted and digitized all 10 Attributes from Templates_AAA_2026-2027/
- Added Attribute III (Lab Equipment Purchases & Dept Library Footfall)
- Added Attribute X (Institutional Values, Green Campus & CSR Extension)
- Implemented Admin Meeting Agenda & Question Configurator modal with live presets (Full 10 Attributes, Executive 15-Min, Research & IPR, Curriculum & Teaching, Student Outcomes & CSR)
- Integrated dynamic filtering across Executive Departmental Dashboard, 60-Minute Slide Deck, and Data Entry Form
- Refreshed sample datasets and cPanel deployment zip
</commit_message>
<xml_diff>
--- a/questions.docx
+++ b/questions.docx
@@ -103,14 +103,69 @@
           <w:sz w:val="24"/>
           <w:szCs w:val="24"/>
         </w:rPr>
+        <w:t>PPT Questionnaire</w:t>
+      </w:r>
+    </w:p>
+    <w:p>
+      <w:pPr>
+        <w:jc w:val="center"/>
+        <w:rPr>
+          <w:rFonts w:ascii="Cambria" w:hAnsi="Cambria"/>
+          <w:b/>
+          <w:bCs/>
+          <w:sz w:val="24"/>
+          <w:szCs w:val="24"/>
+        </w:rPr>
+      </w:pPr>
+    </w:p>
+    <w:p>
+      <w:pPr>
+        <w:jc w:val="center"/>
+        <w:rPr>
+          <w:rFonts w:ascii="Cambria" w:hAnsi="Cambria"/>
+          <w:b/>
+          <w:bCs/>
+          <w:sz w:val="24"/>
+          <w:szCs w:val="24"/>
+        </w:rPr>
+      </w:pPr>
+      <w:r>
+        <w:rPr>
+          <w:rFonts w:ascii="Cambria" w:hAnsi="Cambria"/>
+          <w:sz w:val="24"/>
+          <w:szCs w:val="24"/>
+        </w:rPr>
+        <w:t>Include PART – A  from excel template</w:t>
+      </w:r>
+    </w:p>
+    <w:p>
+      <w:pPr>
+        <w:jc w:val="center"/>
+        <w:rPr>
+          <w:rFonts w:ascii="Cambria" w:hAnsi="Cambria"/>
+          <w:b/>
+          <w:bCs/>
+          <w:sz w:val="24"/>
+          <w:szCs w:val="24"/>
+        </w:rPr>
+      </w:pPr>
+      <w:r>
+        <w:rPr>
+          <w:rFonts w:ascii="Cambria" w:hAnsi="Cambria"/>
+          <w:b/>
+          <w:bCs/>
+          <w:noProof/>
+          <w:sz w:val="24"/>
+          <w:szCs w:val="24"/>
+        </w:rPr>
         <w:drawing>
-          <wp:anchor distT="0" distB="0" distL="114300" distR="114300" simplePos="0" relativeHeight="251659264" behindDoc="0" locked="0" layoutInCell="1" allowOverlap="1" wp14:anchorId="1C2FE5BE" wp14:editId="6611C0D1">
+          <wp:anchor distT="0" distB="0" distL="114300" distR="114300" simplePos="0" relativeHeight="251659264" behindDoc="0" locked="0" layoutInCell="1" allowOverlap="1" wp14:anchorId="1C2FE5BE" wp14:editId="3A4181A0">
             <wp:simplePos x="0" y="0"/>
             <wp:positionH relativeFrom="column">
-              <wp:posOffset>-660400</wp:posOffset>
+              <wp:posOffset>-666750</wp:posOffset>
             </wp:positionH>
             <wp:positionV relativeFrom="paragraph">
-              <wp:posOffset>295910</wp:posOffset>
+              <wp:posOffset>285115</wp:posOffset>
             </wp:positionV>
             <wp:extent cx="2139950" cy="1409951"/>
             <wp:effectExtent l="0" t="0" r="0" b="0"/>
@@ -172,28 +227,7 @@
           <w:rFonts w:ascii="Cambria" w:hAnsi="Cambria"/>
           <w:b/>
           <w:bCs/>
-          <w:sz w:val="24"/>
-          <w:szCs w:val="24"/>
-        </w:rPr>
-        <w:t>PPT Questionnaire</w:t>
-      </w:r>
-    </w:p>
-    <w:p>
-      <w:pPr>
-        <w:jc w:val="center"/>
-        <w:rPr>
-          <w:rFonts w:ascii="Cambria" w:hAnsi="Cambria"/>
-          <w:b/>
-          <w:bCs/>
-          <w:sz w:val="24"/>
-          <w:szCs w:val="24"/>
-        </w:rPr>
-      </w:pPr>
-      <w:r>
-        <w:rPr>
-          <w:rFonts w:ascii="Cambria" w:hAnsi="Cambria"/>
-          <w:b/>
-          <w:bCs/>
+          <w:noProof/>
           <w:sz w:val="24"/>
           <w:szCs w:val="24"/>
         </w:rPr>
@@ -272,6 +306,7 @@
           <w:rFonts w:ascii="Cambria" w:hAnsi="Cambria"/>
           <w:b/>
           <w:bCs/>
+          <w:noProof/>
           <w:sz w:val="24"/>
           <w:szCs w:val="24"/>
         </w:rPr>
@@ -378,6 +413,7 @@
           <w:rFonts w:ascii="Cambria" w:hAnsi="Cambria"/>
           <w:b/>
           <w:bCs/>
+          <w:noProof/>
           <w:sz w:val="24"/>
           <w:szCs w:val="24"/>
         </w:rPr>
@@ -1643,6 +1679,7 @@
                 <w:b/>
                 <w:bCs/>
               </w:rPr>
+              <w:lastRenderedPageBreak/>
               <w:t>Description</w:t>
             </w:r>
           </w:p>
@@ -1764,7 +1801,6 @@
                 <w:b/>
                 <w:bCs/>
               </w:rPr>
-              <w:lastRenderedPageBreak/>
               <w:t>Fee Collected:</w:t>
             </w:r>
           </w:p>
@@ -1806,7 +1842,6 @@
                 <w:b/>
                 <w:bCs/>
               </w:rPr>
-              <w:lastRenderedPageBreak/>
               <w:t>CC</w:t>
             </w:r>
           </w:p>
@@ -3267,25 +3302,7 @@
                 <w:b/>
                 <w:bCs/>
               </w:rPr>
-              <w:t xml:space="preserve">Mention the name of the </w:t>
-            </w:r>
-            <w:proofErr w:type="gramStart"/>
-            <w:r>
-              <w:rPr>
-                <w:rFonts w:ascii="Cambria" w:hAnsi="Cambria"/>
-                <w:b/>
-                <w:bCs/>
-              </w:rPr>
-              <w:t>Faculty</w:t>
-            </w:r>
-            <w:proofErr w:type="gramEnd"/>
-            <w:r>
-              <w:rPr>
-                <w:rFonts w:ascii="Cambria" w:hAnsi="Cambria"/>
-                <w:b/>
-                <w:bCs/>
-              </w:rPr>
-              <w:t xml:space="preserve"> served in International / National Level</w:t>
+              <w:t>Mention the name of the Faculty served in International / National Level</w:t>
             </w:r>
           </w:p>
         </w:tc>
@@ -3365,6 +3382,7 @@
                 <w:b/>
                 <w:bCs/>
               </w:rPr>
+              <w:lastRenderedPageBreak/>
               <w:t>Through FDC:</w:t>
             </w:r>
           </w:p>
@@ -3420,7 +3438,6 @@
                 <w:b/>
                 <w:bCs/>
               </w:rPr>
-              <w:lastRenderedPageBreak/>
               <w:t xml:space="preserve">Gone for </w:t>
             </w:r>
             <w:r>
@@ -4799,18 +4816,8 @@
                 <w:b/>
                 <w:bCs/>
               </w:rPr>
-              <w:t xml:space="preserve">Previous active </w:t>
-            </w:r>
-            <w:proofErr w:type="spellStart"/>
-            <w:r>
-              <w:rPr>
-                <w:rFonts w:ascii="Cambria" w:hAnsi="Cambria"/>
-                <w:b/>
-                <w:bCs/>
-              </w:rPr>
-              <w:t>MoUs</w:t>
-            </w:r>
-            <w:proofErr w:type="spellEnd"/>
+              <w:t>Previous active MoUs</w:t>
+            </w:r>
           </w:p>
         </w:tc>
         <w:tc>
@@ -5045,23 +5052,14 @@
           <w:bCs/>
         </w:rPr>
       </w:pPr>
-      <w:proofErr w:type="spellStart"/>
       <w:r>
         <w:rPr>
           <w:rFonts w:ascii="Cambria" w:hAnsi="Cambria"/>
           <w:b/>
           <w:bCs/>
         </w:rPr>
-        <w:t>Att</w:t>
-      </w:r>
-      <w:proofErr w:type="spellEnd"/>
-      <w:r>
-        <w:rPr>
-          <w:rFonts w:ascii="Cambria" w:hAnsi="Cambria"/>
-          <w:b/>
-          <w:bCs/>
-        </w:rPr>
-        <w:t xml:space="preserve"> 6 &amp; 8</w:t>
+        <w:lastRenderedPageBreak/>
+        <w:t>Att 6 &amp; 8</w:t>
       </w:r>
     </w:p>
     <w:tbl>
@@ -5099,7 +5097,6 @@
                 <w:b/>
                 <w:bCs/>
               </w:rPr>
-              <w:lastRenderedPageBreak/>
               <w:t>Club Name</w:t>
             </w:r>
           </w:p>
@@ -5462,21 +5459,7 @@
               <w:rPr>
                 <w:rFonts w:ascii="Cambria" w:hAnsi="Cambria"/>
               </w:rPr>
-              <w:t xml:space="preserve"> </w:t>
-            </w:r>
-            <w:proofErr w:type="spellStart"/>
-            <w:r>
-              <w:rPr>
-                <w:rFonts w:ascii="Cambria" w:hAnsi="Cambria"/>
-              </w:rPr>
-              <w:t>estd</w:t>
-            </w:r>
-            <w:proofErr w:type="spellEnd"/>
-            <w:r>
-              <w:rPr>
-                <w:rFonts w:ascii="Cambria" w:hAnsi="Cambria"/>
-              </w:rPr>
-              <w:t xml:space="preserve"> in A.Y 2026-2027</w:t>
+              <w:t xml:space="preserve"> estd in A.Y 2026-2027</w:t>
             </w:r>
           </w:p>
         </w:tc>
@@ -5792,7 +5775,6 @@
                 <w:bCs/>
               </w:rPr>
             </w:pPr>
-            <w:proofErr w:type="spellStart"/>
             <w:r>
               <w:rPr>
                 <w:rFonts w:ascii="Cambria" w:hAnsi="Cambria"/>
@@ -5802,7 +5784,6 @@
               </w:rPr>
               <w:t>Programme</w:t>
             </w:r>
-            <w:proofErr w:type="spellEnd"/>
           </w:p>
         </w:tc>
         <w:tc>
@@ -7050,23 +7031,13 @@
                 <w:bCs/>
               </w:rPr>
             </w:pPr>
-            <w:proofErr w:type="spellStart"/>
-            <w:r>
-              <w:rPr>
-                <w:rFonts w:ascii="Cambria" w:hAnsi="Cambria"/>
-                <w:b/>
-                <w:bCs/>
-              </w:rPr>
-              <w:t>WoS</w:t>
-            </w:r>
-            <w:proofErr w:type="spellEnd"/>
-            <w:r>
-              <w:rPr>
-                <w:rFonts w:ascii="Cambria" w:hAnsi="Cambria"/>
-                <w:b/>
-                <w:bCs/>
-              </w:rPr>
-              <w:t>:</w:t>
+            <w:r>
+              <w:rPr>
+                <w:rFonts w:ascii="Cambria" w:hAnsi="Cambria"/>
+                <w:b/>
+                <w:bCs/>
+              </w:rPr>
+              <w:t>WoS:</w:t>
             </w:r>
           </w:p>
           <w:p>
@@ -7148,7 +7119,6 @@
                 <w:bCs/>
               </w:rPr>
             </w:pPr>
-            <w:proofErr w:type="gramStart"/>
             <w:r>
               <w:rPr>
                 <w:rFonts w:ascii="Cambria" w:hAnsi="Cambria"/>
@@ -7157,7 +7127,6 @@
               </w:rPr>
               <w:t>Non Indexed</w:t>
             </w:r>
-            <w:proofErr w:type="gramEnd"/>
           </w:p>
         </w:tc>
         <w:tc>
@@ -8179,6 +8148,7 @@
   <w:style w:type="character" w:default="1" w:styleId="DefaultParagraphFont">
     <w:name w:val="Default Paragraph Font"/>
     <w:uiPriority w:val="1"/>
+    <w:semiHidden/>
     <w:unhideWhenUsed/>
   </w:style>
   <w:style w:type="table" w:default="1" w:styleId="TableNormal">

</xml_diff>